<commit_message>
Correct manuscripts: humidity/temperature are not in the current model
The model is driven by wind speed, wind direction, and stability class
only; relative humidity and temperature are displayed but do not enter
the dispersion calculation (temperature only informs the stability
estimate). Move the humidity/hygroscopic/washout/thunderstorm content
out of the model description and reframe it honestly as future work in
both the conference paper and the JEI manuscript. Also update the JEI
manuscript to potential-flow wind, SAM detection, the rooftop-overlap
tree filter, multi-campus labeling, and the weighted "Other" class;
rebuild paper.pdf, paper.docx, and CAM_JEI_manuscript.docx.

Co-authored-by: Cursor <cursoragent@cursor.com>
</commit_message>
<xml_diff>
--- a/docs/jei_submission/CAM_JEI_manuscript.docx
+++ b/docs/jei_submission/CAM_JEI_manuscript.docx
@@ -105,7 +105,7 @@
           <w:i w:val="0"/>
           <w:sz w:val="22"/>
         </w:rPr>
-        <w:t>Allergic rhinitis affects 10-30% of people, and airborne pollen is its leading environmental trigger. Regional pollen forecasts report a single value for an entire city, so they cannot explain why symptoms differ between one campus walkway and another only tens of meters away. We asked whether the pollen exposure a student experiences while walking across a school campus can be predicted at meter scale from the physics of how pollen travels through air. We hypothesized that combining a steady-state Gaussian plume solution of the atmospheric advection-diffusion equation with the measured positions of individual trees would reproduce the sharp, building- and wind-dependent concentration gradients that regional monitors miss. To test this, we built Campus AeroAllergen Mapping (CAM), a web system that locates every tree on a 25-hectare campus from satellite imagery, models each tree as a pollen source, and superposes their plumes at a student breathing height of 1.5 m. Applied to a campus with 1,018 detected trees across six allergenic genera, the model produced meter-scale concentration fields in under one second, showing plume elongation along the wind, near-zero concentration over buildings, and elevated pollen in tree-dense corridors. Using a fixed seasonal scale, summer concentrations were about 6% of the spring peak. These results support the hypothesis that hyperlocal pollen exposure is predictable from physical modeling. The system reports lower-exposure walking routes, though we have not yet validated its predictions against measured pollen counts.</w:t>
+        <w:t>Allergic rhinitis affects 10-30% of people, and airborne pollen is its leading environmental trigger. Regional pollen forecasts report a single value for an entire city, so they cannot explain why symptoms differ between one campus walkway and another only tens of meters away. We asked whether the pollen exposure a student experiences while walking across a school campus can be predicted at meter scale from the physics of how pollen travels through air. We hypothesized that coupling a two-dimensional potential-flow wind field, which deflects and channels the wind around buildings, with a steady-state Gaussian plume solution of the atmospheric advection-diffusion equation, driven by the measured positions of individual trees, would reproduce the sharp, building- and wind-dependent concentration gradients that regional monitors miss. To test this, we built Campus AeroAllergen Mapping (CAM), a web system that locates individual trees from satellite imagery and detects building rooftops with a deep-learning segmentation model, models each tree as a pollen source, and superposes their plumes along the local wind at a student breathing height of 1.5 m. We applied CAM to two campuses of contrasting scale: Henry M. Gunn High School (about 900 trees across seven allergenic genera) and the Stanford University core (thousands of trees and building rooftops). The model produced meter-scale concentration fields in a few seconds, showing plumes bending along the flow diverted around buildings, near-zero concentration over building footprints, and elevated pollen in tree-dense corridors. Anchoring the species mix to published campus tree inventories reproduced a spring oak peak and, on Gunn, a secondary autumn peak driven by fall-pollinating cedar. These results support the hypothesis that hyperlocal pollen exposure is predictable from physical modeling. The system reports lower-exposure walking routes, though we have not yet validated its predictions against measured pollen counts.</w:t>
       </w:r>
     </w:p>
     <w:p>
@@ -158,7 +158,7 @@
           <w:i w:val="0"/>
           <w:sz w:val="22"/>
         </w:rPr>
-        <w:t>We therefore asked whether the hyperlocal pollen exposure experienced by a student walking across a campus can be predicted from first-principles atmospheric physics. We hypothesized that a steady-state Gaussian plume model, driven by the measured positions of individual trees, real-time wind, species-specific bloom timing, and building geometry, would reproduce the sharp spatial concentration gradients that regional monitoring cannot capture, and would do so quickly enough for interactive daily use. To test this, we developed Campus AeroAllergen Mapping (CAM), a system that (i) identifies pollen sources from satellite imagery, (ii) solves the advection-diffusion equation analytically at each source, (iii) modulates emission by species-specific phenology, (iv) accounts for building-induced flow changes, and (v) integrates exposure along student walking paths. We deployed and evaluated the system at Henry M. Gunn High School (Palo Alto, CA), a 25-hectare campus with over 1,000 trees.</w:t>
+        <w:t>We therefore asked whether the hyperlocal pollen exposure experienced by a student walking across a campus can be predicted from first-principles atmospheric physics. We hypothesized that a steady-state Gaussian plume model, driven by the measured positions of individual trees, real-time wind, species-specific bloom timing, and a wind field that flows around campus buildings, would reproduce the sharp spatial concentration gradients that regional monitoring cannot capture, and would do so quickly enough for interactive daily use. To test this, we developed Campus AeroAllergen Mapping (CAM), a system that (i) identifies pollen sources (tree canopies) and building rooftops from satellite imagery, the latter using a pretrained deep-learning segmentation model, (ii) computes a two-dimensional potential-flow wind field that deflects and channels the wind around the buildings, (iii) solves the advection-diffusion equation analytically at each source using the local wind, (iv) modulates emission by species-specific phenology, and (v) integrates exposure along student walking paths. We deployed and evaluated the system on two campuses of contrasting scale and layout: Henry M. Gunn High School (Palo Alto, CA), a 25-hectare campus with about 900 mapped trees, and the core of Stanford University, with thousands of trees and buildings.</w:t>
       </w:r>
     </w:p>
     <w:p>
@@ -189,7 +189,7 @@
           <w:i w:val="0"/>
           <w:sz w:val="22"/>
         </w:rPr>
-        <w:t>To test whether campus pollen exposure could be predicted from physical modeling, we first needed the locations of the pollen sources. We detected trees from high-resolution satellite imagery using color-based segmentation with watershed splitting, followed by three rounds of human verification to remove false positives (see Materials and Methods). This process identified 1,018 trees across six allergenic genera: 414 Coast Live Oak, 239 Coast Redwood, 159 Valley Oak, 110 Pine, 76 Western Sycamore, and 20 Chinese Elm. Automated detection alone achieved approximately 75% precision; after three interactive correction rounds, the false-positive rate fell below 5%, indicating that the source map used as input to the physical model was reliable.</w:t>
+        <w:t>To test whether campus pollen exposure could be predicted from physical modeling, we first needed the locations of the pollen sources. We detected tree canopies from high-resolution satellite imagery using color-based segmentation with watershed splitting, and building rooftops using the Segment Anything Model (SAM), a pretrained deep-learning segmentation network, followed by human verification through an interactive map editor (see Materials and Methods). To keep the labeling faithful to each real campus, we anchored the species mix to published tree inventories. For Gunn, the 2009 Palo Alto Unified School District arborist survey of 455 numbered trees is dominated by Valley Oak (25.5%), Coast Redwood (20.2%), and Coast Live Oak (15.4%), with Cedar, Western Sycamore, and Chinese Elm following; all oaks together make up about 42%. We labeled the roughly 900 mapped Gunn canopies against these seven allergenic genera and assigned the long tail of unmodeled ornamental genera to a generic 'Other' class. For the much larger Stanford core, tiled SAM detection identified on the order of 3,000 building rooftops and about 9,900 raw tree canopies; after geometrically removing canopies that fell mostly on rooftops (about 43% of the raw detections, likely false positives), about 5,650 trees remained, which we labeled against Stanford's six most abundant genera reported in its campus inventory (Coast Live Oak, the single most numerous species at about 40%, plus Canary Island Palm, Eucalyptus, Coast Redwood, Valley Oak, and Olive).</w:t>
       </w:r>
     </w:p>
     <w:p>
@@ -200,7 +200,7 @@
           <w:i w:val="0"/>
           <w:sz w:val="22"/>
         </w:rPr>
-        <w:t>We then computed the pollen concentration field by modeling each detected tree as a Gaussian plume source and summing the contributions at a student breathing height of 1.5 m. The resulting fields displayed the spatial structure predicted by advection-diffusion physics (Figure 1). Concentration was highest immediately downwind of dense tree clusters and fell off as a bell-shaped curve to either side of the plume centerline; stronger modeled winds elongated and diluted the plumes, while more stable atmospheric conditions confined them into narrow, concentrated bands. These patterns match the behavior the Gaussian plume solution predicts.</w:t>
+        <w:t>We then computed the pollen concentration field by first solving a two-dimensional potential-flow wind field that deflects and channels the ambient wind around the detected building footprints, and then modeling each detected tree as a Gaussian plume driven by the local wind at its location, summing the contributions at a student breathing height of 1.5 m. The resulting fields displayed the spatial structure predicted by advection-diffusion physics (Figure 1). Concentration was highest immediately downwind of dense tree clusters and fell off as a bell-shaped curve to either side of the plume centerline; stronger modeled winds elongated and diluted the plumes, while more stable atmospheric conditions confined them into narrow, concentrated bands. These patterns match the behavior the Gaussian plume solution predicts.</w:t>
       </w:r>
     </w:p>
     <w:p>
@@ -222,7 +222,7 @@
           <w:i w:val="0"/>
           <w:sz w:val="22"/>
         </w:rPr>
-        <w:t>Pollen emission is strongly seasonal, so we modulated each source by a species-specific temporal gate function (Figure 3). Using a fixed annual concentration scale (500 grains/m^3 defined as the spring peak) to enable seasonal comparison, the modeled maximum concentration was 273 grains/m^3 on April 1 (day 91), with eight species actively emitting; 30 grains/m^3 on June 25 (day 176), when only Pine remained weakly active; and effectively zero in mid-January, when all species were dormant. Summer concentrations were therefore approximately 6% of the spring peak, quantifying how strongly exposure depends on the time of year.</w:t>
+        <w:t>Pollen emission is strongly seasonal, so we modulated each source by a species-specific temporal gate function (Figure 3). Most campus genera bloom in late winter through spring, but cedar pollinates in the fall, so the model produces a dominant spring peak driven by oaks and a distinct secondary autumn peak on the Gunn campus. Using a fixed annual concentration scale (500 grains/m^3 defined as the spring peak) to enable seasonal comparison, the modeled spring maximum reached several hundred grains/m^3 with multiple species actively emitting, fell to a low background in early summer once the oaks finished, and dropped to effectively zero in mid-winter when all species were dormant. This quantifies how strongly exposure depends on the time of year.</w:t>
       </w:r>
     </w:p>
     <w:p>
@@ -233,7 +233,7 @@
           <w:i w:val="0"/>
           <w:sz w:val="22"/>
         </w:rPr>
-        <w:t>We also incorporated relative humidity, which suppresses pollen emission as anthers require drying to release grains and increases grain settling through hygroscopic swelling (Figure 4). Under the modeled humidity response, emission dropped to as little as 10% of its dry-air value at 90% relative humidity, consistent with the common observation that pollen loads are lowest during humid marine-layer mornings and highest on dry afternoons.</w:t>
+        <w:t>The current model is driven by wind speed, wind direction, and atmospheric stability class. We retrieve relative humidity and temperature from the weather service and display them, but they do not yet enter the dispersion calculation (temperature only informs the stability-class estimate). Because humidity is known to strongly modulate real pollen loads, we designed, but have not yet implemented, a humidity coupling in which emission is suppressed at high relative humidity (anthers require drying to release grains), hygroscopic swelling increases grain settling, and rainfall scavenges airborne pollen (Figure 4); the qualitative form of these responses is shown for reference. Implementing and validating this coupling against measured pollen and weather data is planned future work.</w:t>
       </w:r>
     </w:p>
     <w:p>
@@ -244,7 +244,7 @@
           <w:i w:val="0"/>
           <w:sz w:val="22"/>
         </w:rPr>
-        <w:t>Finally, the complete concentration field over the campus showed four consistent features: plume elongation along the prevailing wind, near-zero concentration over building footprints (where outdoor air is excluded), enhanced accumulation in the low-wind wake zones behind buildings, and elevated concentrations in oak-dense corridors. Each full-campus field was computed in under 500 ms on a standard server, fast enough for interactive, real-time use.</w:t>
+        <w:t>Finally, the complete concentration field over each campus showed consistent features: plumes bending along the potential-flow streamlines as the wind was diverted around buildings, near-zero concentration over building footprints (where outdoor air is excluded), locally elevated concentration where the flow was channeled between closely spaced buildings, and elevated concentrations in oak-dense corridors. Each full-campus field was computed in a few seconds on a standard server (well under one second for Gunn), fast enough for interactive, real-time use even with the thousands of sources on the Stanford campus.</w:t>
       </w:r>
     </w:p>
     <w:p>
@@ -275,7 +275,7 @@
           <w:i w:val="0"/>
           <w:sz w:val="22"/>
         </w:rPr>
-        <w:t>Our results support the hypothesis that the pollen exposure experienced while walking across a campus can be predicted at meter scale from the physics of atmospheric transport, rather than requiring a dense network of physical sensors. By modeling each of 1,018 detected trees as a Gaussian plume source, the system reproduced the concentration gradients that regional, city-scale monitoring inherently averages away: sharp downwind plumes, species-dependent hot spots, building exclusion zones, and wake accumulation. The sub-second computation time makes the approach practical as an interactive tool that a student could consult before choosing a route to class.</w:t>
+        <w:t>Our results support the hypothesis that the pollen exposure experienced while walking across a campus can be predicted at meter scale from the physics of atmospheric transport, rather than requiring a dense network of physical sensors. By modeling each detected tree as a Gaussian plume source driven by a potential-flow wind field around the buildings, the system reproduced the concentration gradients that regional, city-scale monitoring inherently averages away: plumes bending along the flow diverted around buildings, species-dependent hot spots, building exclusion zones, and channeling between closely spaced structures. The few-second computation time makes the approach practical as an interactive tool that a student could consult before choosing a route to class.</w:t>
       </w:r>
     </w:p>
     <w:p>
@@ -286,7 +286,7 @@
           <w:i w:val="0"/>
           <w:sz w:val="22"/>
         </w:rPr>
-        <w:t>Several limitations should temper interpretation of these results. First, and most importantly, the model has not yet been validated against ground-truth pollen measurements; our results demonstrate that the system reproduces the qualitative spatial structure predicted by dispersion theory, but they do not establish quantitative accuracy of the predicted concentrations. Direct comparison against co-located pollen samplers is the essential next step. Second, the model assumes a spatially uniform wind field; real airflow is channeled and deflected by buildings in ways that would require computational fluid dynamics to capture fully, and our Schulman-Scire wake correction is only an empirical approximation. Third, species were classified from RGB satellite imagery and a size-based heuristic, which is imperfect; hyperspectral imagery or ground surveys would improve species assignment, which in turn affects emission timing and potency. Fourth, several physical parameters (base emission rates, potency weights, phenological windows) are drawn from the literature rather than measured on site, so absolute concentrations should be treated as modeled estimates rather than measurements.</w:t>
+        <w:t>Several limitations should temper interpretation of these results. First, and most importantly, the model has not yet been validated against ground-truth pollen measurements; our results demonstrate that the system reproduces the qualitative spatial structure predicted by dispersion theory, but they do not establish quantitative accuracy of the predicted concentrations. Direct comparison against co-located pollen samplers is the essential next step. Second, our two-dimensional potential-flow wind field is inviscid: it captures how wind is diverted and channeled around buildings but produces no turbulent wake or recirculation zone behind them, so pollen trapping in lee zones is not represented; a viscous computational-fluid-dynamics treatment would be required to capture that. Third, species were classified from RGB satellite imagery and a size-based heuristic, which is imperfect; hyperspectral imagery or ground surveys would improve species assignment, which in turn affects emission timing and potency. Fourth, several physical parameters (base emission rates, potency weights, phenological windows) are drawn from the literature rather than measured on site, so absolute concentrations should be treated as modeled estimates rather than measurements.</w:t>
       </w:r>
     </w:p>
     <w:p>
@@ -361,7 +361,7 @@
           <w:i w:val="0"/>
           <w:sz w:val="22"/>
         </w:rPr>
-        <w:t>Plume spreads followed Pasquill-Gifford power laws, sigma_y = a_y (x')^b_y and sigma_z = a_z (x')^b_z, with coefficients tabulated for atmospheric stability classes A-F (Table 1). Stability was estimated from wind speed and cloud cover using Turner's method (5). Species-dependent gravitational settling was included via Stokes' law, tilting the plume centerline downward with distance, and building wakes were represented using the Schulman-Scire downwash model (6), which inflates the dispersion coefficients near structures and imposes a uniform cavity concentration within the near-wake recirculation zone. Because the governing equation is linear, the total field from all N sources was obtained by superposition, C_total = sum of C_i, evaluated with vectorized array operations over a 120 x 120 spatial grid (5.3 m resolution). Concentration over detected building footprints was set to zero to represent indoor exclusion.</w:t>
+        <w:t>Plume spreads followed Pasquill-Gifford power laws, sigma_y = a_y (x')^b_y and sigma_z = a_z (x')^b_z, with coefficients tabulated for atmospheric stability classes A-F (Table 1). Stability was estimated from wind speed and cloud cover using Turner's method (5). Species-dependent gravitational settling was included via Stokes' law, tilting the plume centerline downward with distance. Rather than assuming a spatially uniform wind, we first solved a two-dimensional potential-flow wind field on the same grid by treating the horizontal flow as incompressible and irrotational (Laplace's equation) with the detected building footprints as no-penetration obstacles; this deflects and channels the ambient wind around buildings. Each tree's plume was then driven by the local wind sampled at its own grid cell, so plumes bend and stretch with the flow. Because the governing equation is linear, the total field from all N sources was obtained by superposition, C_total = sum of C_i, evaluated with vectorized array operations over a 120 x 120 spatial grid. Concentration over detected building footprints was set to zero to represent indoor exclusion. The model uses wind speed, wind direction, and stability class as its meteorological inputs; humidity and temperature are displayed but do not currently enter the calculation (see Results and Discussion).</w:t>
       </w:r>
     </w:p>
     <w:p>
@@ -383,7 +383,7 @@
           <w:i w:val="0"/>
           <w:sz w:val="22"/>
         </w:rPr>
-        <w:t>Each species' time-varying emission was modeled as Q_i(t) = Q_base,i * W_i * Gamma_i(t), where Q_base,i is the peak base emission rate (grains/s), W_i is a dimensionless allergen potency weight (0-5), and Gamma_i(t) is a truncated Gaussian temporal gate, Gamma_i(t) = exp(-(t - t_peak)^2 / (2 sigma_t^2)) within the pollination window [t_start, t_end] and zero otherwise, with t the Julian day of year. Base emission rates, potency weights, and phenological windows for the six campus genera were taken from aerobiological literature and Bay Area regional data (7) (Table 2). Relative humidity, obtained from the weather service, further suppressed emission (anthers require drying to dehisce) and increased grain settling through hygroscopic swelling.</w:t>
+        <w:t>Each species' time-varying emission was modeled as Q_i(t) = Q_base,i * W_i * Gamma_i(t), where Q_base,i is the peak base emission rate (grains/s), W_i is a dimensionless allergen potency weight (0-5), and Gamma_i(t) is a truncated Gaussian temporal gate, Gamma_i(t) = exp(-(t - t_peak)^2 / (2 sigma_t^2)) within the pollination window [t_start, t_end] and zero otherwise, with t the Julian day of year. Base emission rates, potency weights, and phenological windows for the campus genera were taken from aerobiological literature and Bay Area regional data (7) (Table 2). Trees not confidently assigned to a modeled genus were placed in a generic Other class, modeled as a prevalence-weighted blend of each campus's unmodeled tail genera so that unclassified canopies still contribute a realistic, inventory-grounded background. Relative humidity and temperature are retrieved from the weather service and displayed, but do not currently modify emission or transport; a humidity coupling (emission suppression, hygroscopic swelling, and rainfall washout) is described as future work.</w:t>
       </w:r>
     </w:p>
     <w:p>
@@ -405,7 +405,7 @@
           <w:i w:val="0"/>
           <w:sz w:val="22"/>
         </w:rPr>
-        <w:t>Campus satellite imagery (approximately 0.5 m/pixel) was obtained from the Esri World Imagery REST export service for the campus bounding box (557 m x 637 m; 1600 x 1398 pixels). Tree-canopy pixels were classified with color thresholds calibrated on human-verified samples using green excess g_e = g - (r + b)/2 and mean brightness. Adjacent canopies were separated using marker-controlled watershed segmentation (8): the binary canopy mask was eroded to form seed markers, a Euclidean distance transform was computed, and the watershed algorithm segmented individual canopies. Each detected canopy was assigned a species using a size- and position-based heuristic. Detected canopies were converted from pixel coordinates to latitude/longitude and then to local meters relative to the campus center for use as plume sources. Building rooftops were detected as low-saturation, high-brightness connected regions and used to define the indoor exclusion mask.</w:t>
+        <w:t>Campus satellite imagery (approximately 0.5 m/pixel) was obtained from public sources per campus (Esri World Imagery for Gunn; USGS NAIP, stitched seam-free from Web-Mercator tiles, for the Stanford core). Tree-canopy pixels were classified with color thresholds calibrated on human-verified samples using green excess g_e = g - (r + b)/2 and mean brightness. Adjacent canopies were separated using marker-controlled watershed segmentation (8): the binary canopy mask was eroded to form seed markers, a Euclidean distance transform was computed, and the watershed algorithm segmented individual canopies. Each detected canopy was assigned a species; to keep labels faithful to each campus, species proportions were anchored to published tree inventories, and canopies not confidently identified were placed in the Other class. Building rooftops, which are hard to separate from pavement and dry ground by color alone, were detected with the Segment Anything Model (SAM) (9), a pretrained deep-learning segmentation network, run on overlapping image tiles so small rooftops resolve at higher effective resolution and then merged; retained masks were filtered by rooftop color, size, and compactness and reduced to oriented rectangles. On the dense Stanford core, tree candidates whose canopy disk overlapped a detected building footprint by more than 50 percent were removed as rooftop false positives. Detected footprints define the indoor exclusion mask and the obstacles for the potential-flow wind field. SAM was run once at cache-generation time; the deployed server runs no machine-learning model.</w:t>
       </w:r>
     </w:p>
     <w:p>
@@ -427,7 +427,7 @@
           <w:i w:val="0"/>
           <w:sz w:val="22"/>
         </w:rPr>
-        <w:t>Detection was refined iteratively: automated detection proposed candidate trees, a reviewer removed false positives through an interactive map interface, and the verified positions were persisted and used to update the detection thresholds. Three rounds reduced the false-positive rate from approximately 25% to below 5%.</w:t>
+        <w:t>Detection was refined iteratively through an interactive map editor: automated detection proposed candidates, and a reviewer corrected them directly on the satellite basemap. For trees this included deleting false positives, relocating a canopy, resizing its radius (which rescales that tree's emission by canopy area), and reclassifying its species; for buildings it included editing each footprint's name, floor count, position, and shape, including non-rectangular (parallelogram or trapezoid) footprints. Corrections were persisted to the per-campus detection cache the server serves, so the physical model always reflects the reviewed geometry. Automated detection alone reached roughly 75 percent precision; targeted human correction raised it above 95 percent.</w:t>
       </w:r>
     </w:p>
     <w:p>
@@ -611,6 +611,17 @@
           <w:sz w:val="22"/>
         </w:rPr>
         <w:t>8. Beucher, S. and Meyer, F. The morphological approach to segmentation: the watershed transformation. In Mathematical Morphology in Image Processing, 433-481 (1992).</w:t>
+      </w:r>
+    </w:p>
+    <w:p>
+      <w:r>
+        <w:rPr>
+          <w:rFonts w:ascii="Arial" w:hAnsi="Arial"/>
+          <w:b w:val="0"/>
+          <w:i w:val="0"/>
+          <w:sz w:val="22"/>
+        </w:rPr>
+        <w:t>9. Kirillov, A., Mintun, E., Ravi, N., et al. Segment Anything. In Proceedings of the IEEE/CVF International Conference on Computer Vision (ICCV) (2023).</w:t>
       </w:r>
     </w:p>
     <w:p>
@@ -848,7 +859,7 @@
           <w:i w:val="0"/>
           <w:sz w:val="22"/>
         </w:rPr>
-        <w:t>Figure 4. Modeled humidity effects on pollen behavior. (a) Emission suppression factor: pollen release drops sharply above 50% relative humidity. (b) Hygroscopic swelling increases grain diameter at high humidity. (c) Resulting increase in gravitational settling velocity.</w:t>
+        <w:t>Figure 4. Proposed humidity coupling (future work; not part of the current model). (a) Emission suppression factor: pollen release drops sharply above 50% relative humidity. (b) Hygroscopic swelling increases grain diameter at high humidity. (c) Resulting increase in gravitational settling velocity.</w:t>
       </w:r>
     </w:p>
     <w:p>

</xml_diff>